<commit_message>
Add interactive RDQA demo link to all application documents
Added https://rdqa-demo.vercel.app/ demo dashboard reference to:
- Technical Proposal (DOCX): Executive Summary, Digital Tools section, signature area
- Budget (XLSX): Footer of both Budget Summary and Monthly Breakdown sheets
- Inception Report (PPTX): Title slide, Digital Tools slide, Next Steps/Contact slide
- Regenerated PDF from updated DOCX with all demo references

https://claude.ai/code/session_015BtjMoQbpeJ26zz4ypTTxf
</commit_message>
<xml_diff>
--- a/docs/Tiko_RDQA_Technical_Proposal_2026.docx
+++ b/docs/Tiko_RDQA_Technical_Proposal_2026.docx
@@ -1141,6 +1141,34 @@
     </w:p>
     <w:p>
       <w:pPr>
+        <w:spacing w:before="60" w:after="100"/>
+        <w:jc w:val="both"/>
+      </w:pPr>
+      <w:r>
+        <w:rPr>
+          <w:rFonts w:ascii="Arial" w:cs="Arial" w:eastAsia="Arial" w:hAnsi="Arial"/>
+          <w:b w:val="false"/>
+          <w:bCs w:val="false"/>
+          <w:i w:val="false"/>
+          <w:iCs w:val="false"/>
+          <w:sz w:val="20"/>
+          <w:szCs w:val="20"/>
+        </w:rPr>
+        <w:t xml:space="preserve">To demonstrate our technical capabilities and the quality of our analytical outputs, we have developed an interactive RDQA Demo Dashboard showcasing our verification factor analysis, systems assessment visualisations, root cause taxonomy, and data triangulation methodology. The dashboard is accessible at: </w:t>
+      </w:r>
+      <w:r>
+        <w:rPr>
+          <w:b/>
+          <w:color w:val="1A365D"/>
+          <w:sz w:val="20"/>
+          <w:szCs w:val="20"/>
+          <w:rFonts w:ascii="Arial" w:cs="Arial" w:eastAsia="Arial" w:hAnsi="Arial"/>
+        </w:rPr>
+        <w:t>https://rdqa-demo.vercel.app/</w:t>
+      </w:r>
+    </w:p>
+    <w:p>
+      <w:pPr>
         <w:pStyle w:val="Heading1"/>
         <w:spacing w:before="300" w:after="200"/>
       </w:pPr>
@@ -3088,6 +3116,45 @@
           <w:szCs w:val="20"/>
         </w:rPr>
         <w:t xml:space="preserve">We will use KoboToolbox as the primary digital data collection platform for on-site RDQA, leveraging its offline capability (critical for facilities with unreliable connectivity), skip logic, real-time verification ratio auto-calculation, GPS auto-capture, and photo documentation features. We will develop a custom KoboToolbox RDQA instrument adapted to Uganda’s HMIS registers with four modules: Facility Identification, Data Verification (with auto-calculated VFs), Systems Assessment (Likert-scale scoring across five functional areas), and Action Planning. DHIS2 desk review will utilise the WHO Data Quality App already available in Uganda’s national DHIS2 instance. We will work with the Tiko technology team to align our data collection with Tiko’s existing platform and reporting systems.</w:t>
+      </w:r>
+    </w:p>
+    <w:p/>
+    <w:p>
+      <w:pPr>
+        <w:spacing w:before="60" w:after="100"/>
+        <w:jc w:val="both"/>
+      </w:pPr>
+      <w:r>
+        <w:rPr>
+          <w:rFonts w:ascii="Arial" w:cs="Arial" w:eastAsia="Arial" w:hAnsi="Arial"/>
+          <w:b w:val="false"/>
+          <w:bCs w:val="false"/>
+          <w:i w:val="false"/>
+          <w:iCs w:val="false"/>
+          <w:sz w:val="20"/>
+          <w:szCs w:val="20"/>
+        </w:rPr>
+        <w:t xml:space="preserve">In addition to KoboToolbox, we have developed an interactive RDQA Demo Dashboard that demonstrates our analytical capabilities, including Verification Factor visualisation, systems assessment spider charts, root cause taxonomy analysis, monthly process timelines, and three-way data triangulation flows. This dashboard illustrates the type of outputs and analytical rigour we will bring to the Tiko engagement. </w:t>
+      </w:r>
+      <w:r>
+        <w:rPr>
+          <w:b/>
+          <w:sz w:val="20"/>
+          <w:szCs w:val="20"/>
+          <w:rFonts w:ascii="Arial" w:cs="Arial" w:eastAsia="Arial" w:hAnsi="Arial"/>
+        </w:rPr>
+        <w:t xml:space="preserve">Interactive Demo: </w:t>
+      </w:r>
+      <w:r>
+        <w:rPr>
+          <w:b/>
+          <w:color w:val="2B6CB0"/>
+          <w:u w:val="single"/>
+          <w:sz w:val="20"/>
+          <w:szCs w:val="20"/>
+          <w:rFonts w:ascii="Arial" w:cs="Arial" w:eastAsia="Arial" w:hAnsi="Arial"/>
+        </w:rPr>
+        <w:t>https://rdqa-demo.vercel.app/</w:t>
       </w:r>
     </w:p>
     <w:p>
@@ -7693,6 +7760,33 @@
           <w:szCs w:val="20"/>
         </w:rPr>
         <w:t xml:space="preserve">End of Technical Proposal</w:t>
+      </w:r>
+    </w:p>
+    <w:p>
+      <w:pPr>
+        <w:spacing w:before="60" w:after="100"/>
+        <w:jc w:val="center"/>
+      </w:pPr>
+      <w:r>
+        <w:rPr>
+          <w:rFonts w:ascii="Arial" w:cs="Arial" w:eastAsia="Arial" w:hAnsi="Arial"/>
+          <w:i/>
+          <w:iCs/>
+          <w:color w:val="888888"/>
+          <w:sz w:val="20"/>
+          <w:szCs w:val="20"/>
+        </w:rPr>
+        <w:t xml:space="preserve">Interactive RDQA Demo: </w:t>
+      </w:r>
+      <w:r>
+        <w:rPr>
+          <w:color w:val="2B6CB0"/>
+          <w:u w:val="single"/>
+          <w:sz w:val="20"/>
+          <w:szCs w:val="20"/>
+          <w:rFonts w:ascii="Arial" w:cs="Arial" w:eastAsia="Arial" w:hAnsi="Arial"/>
+        </w:rPr>
+        <w:t>https://rdqa-demo.vercel.app/</w:t>
       </w:r>
     </w:p>
     <w:p>

</xml_diff>

<commit_message>
Add RDQA Web Tool link to all Tiko application documents
Added the live R/Shiny RDQA Web Tool link
(https://dnfxdz-raymond-wayesu.shinyapps.io/rdqa-web-tool/)
alongside the existing demo dashboard link in all three documents,
with an explanation of the difference between the two:

- Demo dashboard (rdqa-demo.vercel.app): static Next.js website
  showcasing methodology and sample outputs
- RDQA Web Tool (shinyapps.io): live interactive R/Shiny app with
  real-time VF computation, DHIS2 integration, and report generation

Files updated:
- Technical Proposal (.docx): Executive Summary, Section 3.7, footer
- Inception Report (.pptx): Slides 1, 9, 12
- Budget (.xlsx): Both Budget Summary and Monthly Breakdown sheets

Note: The PDF needs to be regenerated locally from the updated DOCX.

https://claude.ai/code/session_015BtjMoQbpeJ26zz4ypTTxf
</commit_message>
<xml_diff>
--- a/docs/Tiko_RDQA_Technical_Proposal_2026.docx
+++ b/docs/Tiko_RDQA_Technical_Proposal_2026.docx
@@ -1169,6 +1169,33 @@
     </w:p>
     <w:p>
       <w:pPr>
+        <w:spacing w:before="60" w:after="100"/>
+        <w:jc w:val="both"/>
+      </w:pPr>
+      <w:r>
+        <w:t xml:space="preserve">We have also developed a full-featured </w:t>
+      </w:r>
+      <w:r>
+        <w:rPr>
+          <w:b/>
+        </w:rPr>
+        <w:t>RDQA Web Tool</w:t>
+      </w:r>
+      <w:r>
+        <w:t xml:space="preserve"> — a live R/Shiny application that goes beyond the static demo by providing interactive data entry, real-time Verification Factor computation, M&amp;E systems assessment with radar charts, datimvalidation-style checks, three-way data triangulation, and downloadable reports. The web tool supports both demo mode and live DHIS2 integration. It is accessible at: </w:t>
+      </w:r>
+      <w:hyperlink r:id="rId9">
+        <w:r>
+          <w:rPr>
+            <w:color w:val="0563C1"/>
+            <w:u w:val="single"/>
+          </w:rPr>
+          <w:t>https://dnfxdz-raymond-wayesu.shinyapps.io/rdqa-web-tool/</w:t>
+        </w:r>
+      </w:hyperlink>
+    </w:p>
+    <w:p>
+      <w:pPr>
         <w:pStyle w:val="Heading1"/>
         <w:spacing w:before="300" w:after="200"/>
       </w:pPr>
@@ -3156,6 +3183,51 @@
         </w:rPr>
         <w:t>https://rdqa-demo.vercel.app/</w:t>
       </w:r>
+    </w:p>
+    <w:p>
+      <w:pPr>
+        <w:spacing w:before="60" w:after="100"/>
+        <w:jc w:val="both"/>
+      </w:pPr>
+      <w:r>
+        <w:t xml:space="preserve">Beyond the demo dashboard, we have built a fully functional </w:t>
+      </w:r>
+      <w:r>
+        <w:rPr>
+          <w:b/>
+        </w:rPr>
+        <w:t>Routine Data Quality Audit Web Tool (RDQA Web Tool)</w:t>
+      </w:r>
+      <w:r>
+        <w:t xml:space="preserve"> using R/Shiny. While the demo dashboard (</w:t>
+      </w:r>
+      <w:hyperlink r:id="rId10">
+        <w:r>
+          <w:rPr>
+            <w:color w:val="0563C1"/>
+            <w:u w:val="single"/>
+          </w:rPr>
+          <w:t>rdqa-demo.vercel.app</w:t>
+        </w:r>
+      </w:hyperlink>
+      <w:r>
+        <w:t xml:space="preserve">) is a static Next.js website showcasing our analytical methodology and sample outputs, the RDQA Web Tool is a live, interactive application where users can load data (demo or live DHIS2), compute Verification Factors in real time, run datimvalidation-style checks, perform M&amp;E systems assessments with spider charts, and generate downloadable HTML and CSV reports. </w:t>
+      </w:r>
+      <w:r>
+        <w:rPr>
+          <w:b/>
+        </w:rPr>
+        <w:t xml:space="preserve">RDQA Web Tool: </w:t>
+      </w:r>
+      <w:hyperlink r:id="rId9">
+        <w:r>
+          <w:rPr>
+            <w:color w:val="0563C1"/>
+            <w:u w:val="single"/>
+          </w:rPr>
+          <w:t>https://dnfxdz-raymond-wayesu.shinyapps.io/rdqa-web-tool/</w:t>
+        </w:r>
+      </w:hyperlink>
     </w:p>
     <w:p>
       <w:pPr>
@@ -7788,6 +7860,27 @@
         </w:rPr>
         <w:t>https://rdqa-demo.vercel.app/</w:t>
       </w:r>
+    </w:p>
+    <w:p>
+      <w:pPr>
+        <w:spacing w:before="60" w:after="100"/>
+        <w:jc w:val="center"/>
+      </w:pPr>
+      <w:r>
+        <w:rPr>
+          <w:b/>
+        </w:rPr>
+        <w:t xml:space="preserve">RDQA Web Tool (R/Shiny): </w:t>
+      </w:r>
+      <w:hyperlink r:id="rId9">
+        <w:r>
+          <w:rPr>
+            <w:color w:val="0563C1"/>
+            <w:u w:val="single"/>
+          </w:rPr>
+          <w:t>https://dnfxdz-raymond-wayesu.shinyapps.io/rdqa-web-tool/</w:t>
+        </w:r>
+      </w:hyperlink>
     </w:p>
     <w:p>
       <w:pPr>

</xml_diff>

<commit_message>
Update application documents with adjusted budget and CV data
- Replace budget with Paul's adjusted figures ($120/day lead, $100/day analyst,
  5 days/month, transport $0, grand total USD 11,650)
- Update team bios in proposal and presentation with details from new CVs
- Revise team composition to lean two-person core team approach
- Update budget framework section with simplified 4-category structure
- Generate Raymond's RDQA-tailored CV (DOCX + PDF) highlighting data quality,
  health M&E, HMIS, and statistical analysis experience
- Regenerate proposal PDF from updated DOCX

https://claude.ai/code/session_015BtjMoQbpeJ26zz4ypTTxf
</commit_message>
<xml_diff>
--- a/docs/Tiko_RDQA_Technical_Proposal_2026.docx
+++ b/docs/Tiko_RDQA_Technical_Proposal_2026.docx
@@ -4778,15 +4778,10 @@
       </w:pPr>
       <w:r>
         <w:rPr>
-          <w:rFonts w:ascii="Arial" w:cs="Arial" w:eastAsia="Arial" w:hAnsi="Arial"/>
-          <w:b w:val="false"/>
-          <w:bCs w:val="false"/>
-          <w:i w:val="false"/>
-          <w:iCs w:val="false"/>
-          <w:sz w:val="20"/>
-          <w:szCs w:val="20"/>
-        </w:rPr>
-        <w:t xml:space="preserve">Our core team comprises two senior professionals with complementary expertise, supplemented by field auditors who will be mobilised based on the number of facilities per audit cycle.</w:t>
+          <w:rFonts w:ascii="Calibri" w:hAnsi="Calibri"/>
+          <w:sz w:val="22"/>
+        </w:rPr>
+        <w:t>Our core team comprises two senior professionals with complementary expertise in biostatistics, health data quality assurance, and monitoring and evaluation. Both team members are based in Kampala and have direct experience with Uganda's HMIS/DHIS2 infrastructure, ensuring efficient facility coverage across both districts.</w:t>
       </w:r>
     </w:p>
     <w:tbl>
@@ -5039,19 +5034,83 @@
             </w:pPr>
             <w:r>
               <w:rPr>
+                <w:sz w:val="18"/>
+              </w:rPr>
+              <w:t>MSc Biostatistics (Makerere University School of Public Health); 13+ years in health M&amp;E, data quality assurance, and biostatistics; hands-on RDQA experience with PTBi, MGIC/UMB (PEPFAR), and iTECH; proficient in DHIS2, KoboToolbox, STATA, R, REDCap, Power BI, ODK; published researcher with 20+ peer-reviewed publications (Lancet Global Health, BMC, PLOS ONE)</w:t>
+            </w:r>
+          </w:p>
+        </w:tc>
+        <w:tc>
+          <w:tcPr>
+            <w:tcW w:type="dxa" w:w="2760"/>
+            <w:tcBorders>
+              <w:top w:val="single" w:color="CCCCCC" w:sz="1"/>
+              <w:left w:val="single" w:color="CCCCCC" w:sz="1"/>
+              <w:bottom w:val="single" w:color="CCCCCC" w:sz="1"/>
+              <w:right w:val="single" w:color="CCCCCC" w:sz="1"/>
+            </w:tcBorders>
+            <w:tcMar>
+              <w:top w:type="dxa" w:w="60"/>
+              <w:left w:type="dxa" w:w="100"/>
+              <w:bottom w:type="dxa" w:w="60"/>
+              <w:right w:type="dxa" w:w="100"/>
+            </w:tcMar>
+            <w:vAlign w:val="center"/>
+          </w:tcPr>
+          <w:p>
+            <w:pPr>
+              <w:jc w:val="left"/>
+            </w:pPr>
+            <w:r>
+              <w:rPr>
                 <w:rFonts w:ascii="Arial" w:cs="Arial" w:eastAsia="Arial" w:hAnsi="Arial"/>
                 <w:b w:val="false"/>
                 <w:bCs w:val="false"/>
                 <w:sz w:val="20"/>
                 <w:szCs w:val="20"/>
               </w:rPr>
-              <w:t xml:space="preserve">MSc Biostatistics (Makerere); 13+ years in health M&amp;E, DQA, and data management; hands-on RDQA experience with PTBi, MGIC, and iTECH; proficient in DHIS2, KoboToolbox, STATA, R, REDCap; published researcher with 20+ peer-reviewed publications</w:t>
-            </w:r>
-          </w:p>
-        </w:tc>
-        <w:tc>
-          <w:tcPr>
-            <w:tcW w:type="dxa" w:w="2760"/>
+              <w:t xml:space="preserve">Overall technical leadership; RDQA tool design; KCCA/Wakiso coordination; root cause analysis; quarterly data review facilitation; report authorship; quality assurance</w:t>
+            </w:r>
+          </w:p>
+        </w:tc>
+      </w:tr>
+      <w:tr>
+        <w:tc>
+          <w:tcPr>
+            <w:tcW w:type="dxa" w:w="1600"/>
+            <w:tcBorders>
+              <w:top w:val="single" w:color="CCCCCC" w:sz="1"/>
+              <w:left w:val="single" w:color="CCCCCC" w:sz="1"/>
+              <w:bottom w:val="single" w:color="CCCCCC" w:sz="1"/>
+              <w:right w:val="single" w:color="CCCCCC" w:sz="1"/>
+            </w:tcBorders>
+            <w:tcMar>
+              <w:top w:type="dxa" w:w="60"/>
+              <w:left w:type="dxa" w:w="100"/>
+              <w:bottom w:type="dxa" w:w="60"/>
+              <w:right w:type="dxa" w:w="100"/>
+            </w:tcMar>
+            <w:vAlign w:val="center"/>
+          </w:tcPr>
+          <w:p>
+            <w:pPr>
+              <w:jc w:val="left"/>
+            </w:pPr>
+            <w:r>
+              <w:rPr>
+                <w:rFonts w:ascii="Arial" w:cs="Arial" w:eastAsia="Arial" w:hAnsi="Arial"/>
+                <w:b/>
+                <w:bCs/>
+                <w:sz w:val="20"/>
+                <w:szCs w:val="20"/>
+              </w:rPr>
+              <w:t xml:space="preserve">Data Analyst / Biostatistician</w:t>
+            </w:r>
+          </w:p>
+        </w:tc>
+        <w:tc>
+          <w:tcPr>
+            <w:tcW w:type="dxa" w:w="2200"/>
             <w:tcBorders>
               <w:top w:val="single" w:color="CCCCCC" w:sz="1"/>
               <w:left w:val="single" w:color="CCCCCC" w:sz="1"/>
@@ -5078,7 +5137,69 @@
                 <w:sz w:val="20"/>
                 <w:szCs w:val="20"/>
               </w:rPr>
-              <w:t xml:space="preserve">Overall technical leadership; RDQA tool design; KCCA/Wakiso coordination; root cause analysis; quarterly data review facilitation; report authorship; quality assurance</w:t>
+              <w:t xml:space="preserve">Raymond R. Wayesu</w:t>
+            </w:r>
+          </w:p>
+        </w:tc>
+        <w:tc>
+          <w:tcPr>
+            <w:tcW w:type="dxa" w:w="2800"/>
+            <w:tcBorders>
+              <w:top w:val="single" w:color="CCCCCC" w:sz="1"/>
+              <w:left w:val="single" w:color="CCCCCC" w:sz="1"/>
+              <w:bottom w:val="single" w:color="CCCCCC" w:sz="1"/>
+              <w:right w:val="single" w:color="CCCCCC" w:sz="1"/>
+            </w:tcBorders>
+            <w:tcMar>
+              <w:top w:type="dxa" w:w="60"/>
+              <w:left w:type="dxa" w:w="100"/>
+              <w:bottom w:type="dxa" w:w="60"/>
+              <w:right w:type="dxa" w:w="100"/>
+            </w:tcMar>
+            <w:vAlign w:val="center"/>
+          </w:tcPr>
+          <w:p>
+            <w:pPr>
+              <w:jc w:val="left"/>
+            </w:pPr>
+            <w:r>
+              <w:rPr>
+                <w:sz w:val="18"/>
+              </w:rPr>
+              <w:t>MSc Mathematical Statistics (Linköping University, Sweden); BSc Statistics (Makerere University); currently Medical Statistician at UVRI/LSHTM on CEPI immunology project; data quality and integrity experience at Sanyu Africa (BabyGel Study), NSSF, and Iganga-Mayuge HDSS; proficient in R, Python, SAS, STATA, SQL; GCP certified; experience with UBOS national surveys</w:t>
+            </w:r>
+          </w:p>
+        </w:tc>
+        <w:tc>
+          <w:tcPr>
+            <w:tcW w:type="dxa" w:w="2760"/>
+            <w:tcBorders>
+              <w:top w:val="single" w:color="CCCCCC" w:sz="1"/>
+              <w:left w:val="single" w:color="CCCCCC" w:sz="1"/>
+              <w:bottom w:val="single" w:color="CCCCCC" w:sz="1"/>
+              <w:right w:val="single" w:color="CCCCCC" w:sz="1"/>
+            </w:tcBorders>
+            <w:tcMar>
+              <w:top w:type="dxa" w:w="60"/>
+              <w:left w:type="dxa" w:w="100"/>
+              <w:bottom w:type="dxa" w:w="60"/>
+              <w:right w:type="dxa" w:w="100"/>
+            </w:tcMar>
+            <w:vAlign w:val="center"/>
+          </w:tcPr>
+          <w:p>
+            <w:pPr>
+              <w:jc w:val="left"/>
+            </w:pPr>
+            <w:r>
+              <w:rPr>
+                <w:rFonts w:ascii="Arial" w:cs="Arial" w:eastAsia="Arial" w:hAnsi="Arial"/>
+                <w:b w:val="false"/>
+                <w:bCs w:val="false"/>
+                <w:sz w:val="20"/>
+                <w:szCs w:val="20"/>
+              </w:rPr>
+              <w:t xml:space="preserve">Digital RDQA instrument development; Verification Factor computation; DHIS2 data extraction and analysis; dashboard and scorecard generation; systems assessment analysis; statistical reporting</w:t>
             </w:r>
           </w:p>
         </w:tc>
@@ -5107,13 +5228,9 @@
             </w:pPr>
             <w:r>
               <w:rPr>
-                <w:rFonts w:ascii="Arial" w:cs="Arial" w:eastAsia="Arial" w:hAnsi="Arial"/>
-                <w:b/>
-                <w:bCs/>
-                <w:sz w:val="20"/>
-                <w:szCs w:val="20"/>
-              </w:rPr>
-              <w:t xml:space="preserve">Data Analyst / Biostatistician</w:t>
+                <w:sz w:val="18"/>
+              </w:rPr>
+              <w:t>Field Support (if required)</w:t>
             </w:r>
           </w:p>
         </w:tc>
@@ -5140,13 +5257,9 @@
             </w:pPr>
             <w:r>
               <w:rPr>
-                <w:rFonts w:ascii="Arial" w:cs="Arial" w:eastAsia="Arial" w:hAnsi="Arial"/>
-                <w:b w:val="false"/>
-                <w:bCs w:val="false"/>
-                <w:sz w:val="20"/>
-                <w:szCs w:val="20"/>
-              </w:rPr>
-              <w:t xml:space="preserve">Raymond R. Wayesu</w:t>
+                <w:sz w:val="18"/>
+              </w:rPr>
+              <w:t>To be mobilised as needed</w:t>
             </w:r>
           </w:p>
         </w:tc>
@@ -5173,13 +5286,9 @@
             </w:pPr>
             <w:r>
               <w:rPr>
-                <w:rFonts w:ascii="Arial" w:cs="Arial" w:eastAsia="Arial" w:hAnsi="Arial"/>
-                <w:b w:val="false"/>
-                <w:bCs w:val="false"/>
-                <w:sz w:val="20"/>
-                <w:szCs w:val="20"/>
-              </w:rPr>
-              <w:t xml:space="preserve">MSc Statistics (Linköping University); 10+ years in biostatistics, data science, and clinical trials; data quality and integrity experience at UVRI, Sanyu Africa, NSSF; proficient in R, Python, SQL; GCP certified; published researcher</w:t>
+                <w:sz w:val="18"/>
+              </w:rPr>
+              <w:t>Bachelor's degree in public health, statistics, or related field; 3+ years HMIS experience; familiarity with Uganda MoH registers; based in Kampala/Wakiso</w:t>
             </w:r>
           </w:p>
         </w:tc>
@@ -5206,147 +5315,9 @@
             </w:pPr>
             <w:r>
               <w:rPr>
-                <w:rFonts w:ascii="Arial" w:cs="Arial" w:eastAsia="Arial" w:hAnsi="Arial"/>
-                <w:b w:val="false"/>
-                <w:bCs w:val="false"/>
-                <w:sz w:val="20"/>
-                <w:szCs w:val="20"/>
-              </w:rPr>
-              <w:t xml:space="preserve">Digital RDQA instrument development; Verification Factor computation; DHIS2 data extraction and analysis; dashboard and scorecard generation; systems assessment analysis; statistical reporting</w:t>
-            </w:r>
-          </w:p>
-        </w:tc>
-      </w:tr>
-      <w:tr>
-        <w:tc>
-          <w:tcPr>
-            <w:tcW w:type="dxa" w:w="1600"/>
-            <w:tcBorders>
-              <w:top w:val="single" w:color="CCCCCC" w:sz="1"/>
-              <w:left w:val="single" w:color="CCCCCC" w:sz="1"/>
-              <w:bottom w:val="single" w:color="CCCCCC" w:sz="1"/>
-              <w:right w:val="single" w:color="CCCCCC" w:sz="1"/>
-            </w:tcBorders>
-            <w:tcMar>
-              <w:top w:type="dxa" w:w="60"/>
-              <w:left w:type="dxa" w:w="100"/>
-              <w:bottom w:type="dxa" w:w="60"/>
-              <w:right w:type="dxa" w:w="100"/>
-            </w:tcMar>
-            <w:vAlign w:val="center"/>
-          </w:tcPr>
-          <w:p>
-            <w:pPr>
-              <w:jc w:val="left"/>
-            </w:pPr>
-            <w:r>
-              <w:rPr>
-                <w:rFonts w:ascii="Arial" w:cs="Arial" w:eastAsia="Arial" w:hAnsi="Arial"/>
-                <w:b/>
-                <w:bCs/>
-                <w:sz w:val="20"/>
-                <w:szCs w:val="20"/>
-              </w:rPr>
-              <w:t xml:space="preserve">Field Data Quality Auditors (2–4)</w:t>
-            </w:r>
-          </w:p>
-        </w:tc>
-        <w:tc>
-          <w:tcPr>
-            <w:tcW w:type="dxa" w:w="2200"/>
-            <w:tcBorders>
-              <w:top w:val="single" w:color="CCCCCC" w:sz="1"/>
-              <w:left w:val="single" w:color="CCCCCC" w:sz="1"/>
-              <w:bottom w:val="single" w:color="CCCCCC" w:sz="1"/>
-              <w:right w:val="single" w:color="CCCCCC" w:sz="1"/>
-            </w:tcBorders>
-            <w:tcMar>
-              <w:top w:type="dxa" w:w="60"/>
-              <w:left w:type="dxa" w:w="100"/>
-              <w:bottom w:type="dxa" w:w="60"/>
-              <w:right w:type="dxa" w:w="100"/>
-            </w:tcMar>
-            <w:vAlign w:val="center"/>
-          </w:tcPr>
-          <w:p>
-            <w:pPr>
-              <w:jc w:val="left"/>
-            </w:pPr>
-            <w:r>
-              <w:rPr>
-                <w:rFonts w:ascii="Arial" w:cs="Arial" w:eastAsia="Arial" w:hAnsi="Arial"/>
-                <w:b w:val="false"/>
-                <w:bCs w:val="false"/>
-                <w:sz w:val="20"/>
-                <w:szCs w:val="20"/>
-              </w:rPr>
-              <w:t xml:space="preserve">To be recruited</w:t>
-            </w:r>
-          </w:p>
-        </w:tc>
-        <w:tc>
-          <w:tcPr>
-            <w:tcW w:type="dxa" w:w="2800"/>
-            <w:tcBorders>
-              <w:top w:val="single" w:color="CCCCCC" w:sz="1"/>
-              <w:left w:val="single" w:color="CCCCCC" w:sz="1"/>
-              <w:bottom w:val="single" w:color="CCCCCC" w:sz="1"/>
-              <w:right w:val="single" w:color="CCCCCC" w:sz="1"/>
-            </w:tcBorders>
-            <w:tcMar>
-              <w:top w:type="dxa" w:w="60"/>
-              <w:left w:type="dxa" w:w="100"/>
-              <w:bottom w:type="dxa" w:w="60"/>
-              <w:right w:type="dxa" w:w="100"/>
-            </w:tcMar>
-            <w:vAlign w:val="center"/>
-          </w:tcPr>
-          <w:p>
-            <w:pPr>
-              <w:jc w:val="left"/>
-            </w:pPr>
-            <w:r>
-              <w:rPr>
-                <w:rFonts w:ascii="Arial" w:cs="Arial" w:eastAsia="Arial" w:hAnsi="Arial"/>
-                <w:b w:val="false"/>
-                <w:bCs w:val="false"/>
-                <w:sz w:val="20"/>
-                <w:szCs w:val="20"/>
-              </w:rPr>
-              <w:t xml:space="preserve">Bachelor’s degree in public health, statistics, or related field; 3+ years HMIS experience; familiarity with Uganda MoH registers; based in Kampala/Wakiso</w:t>
-            </w:r>
-          </w:p>
-        </w:tc>
-        <w:tc>
-          <w:tcPr>
-            <w:tcW w:type="dxa" w:w="2760"/>
-            <w:tcBorders>
-              <w:top w:val="single" w:color="CCCCCC" w:sz="1"/>
-              <w:left w:val="single" w:color="CCCCCC" w:sz="1"/>
-              <w:bottom w:val="single" w:color="CCCCCC" w:sz="1"/>
-              <w:right w:val="single" w:color="CCCCCC" w:sz="1"/>
-            </w:tcBorders>
-            <w:tcMar>
-              <w:top w:type="dxa" w:w="60"/>
-              <w:left w:type="dxa" w:w="100"/>
-              <w:bottom w:type="dxa" w:w="60"/>
-              <w:right w:type="dxa" w:w="100"/>
-            </w:tcMar>
-            <w:vAlign w:val="center"/>
-          </w:tcPr>
-          <w:p>
-            <w:pPr>
-              <w:jc w:val="left"/>
-            </w:pPr>
-            <w:r>
-              <w:rPr>
-                <w:rFonts w:ascii="Arial" w:cs="Arial" w:eastAsia="Arial" w:hAnsi="Arial"/>
-                <w:b w:val="false"/>
-                <w:bCs w:val="false"/>
-                <w:sz w:val="20"/>
-                <w:szCs w:val="20"/>
-              </w:rPr>
-              <w:t xml:space="preserve">On-site register recounting; data extraction and tallying; photo documentation; preliminary root cause interviews; action point follow-up verification</w:t>
+                <w:sz w:val="18"/>
+              </w:rPr>
+              <w:t>On-site register recounting support; data extraction and tallying; photo documentation (to be deployed if facility volume requires additional capacity beyond core team)</w:t>
             </w:r>
           </w:p>
         </w:tc>
@@ -5358,22 +5329,7 @@
         <w:jc w:val="both"/>
       </w:pPr>
       <w:r>
-        <w:rPr>
-          <w:rFonts w:ascii="Arial" w:cs="Arial" w:eastAsia="Arial" w:hAnsi="Arial"/>
-          <w:b/>
-          <w:bCs/>
-          <w:sz w:val="20"/>
-          <w:szCs w:val="20"/>
-        </w:rPr>
-        <w:t xml:space="preserve">Team management: </w:t>
-      </w:r>
-      <w:r>
-        <w:rPr>
-          <w:rFonts w:ascii="Arial" w:cs="Arial" w:eastAsia="Arial" w:hAnsi="Arial"/>
-          <w:sz w:val="20"/>
-          <w:szCs w:val="20"/>
-        </w:rPr>
-        <w:t xml:space="preserve">Paul Mubiri will serve as the single point of contact with Tiko’s programme team. Weekly internal team briefings will ensure consistent tool application and data quality. Raymond Wayesu will provide centralised data management and analysis support, enabling rapid turnaround of facility reports. Field auditors will be supervised by the Lead Consultant and will operate in sub-teams of 2–3 persons per facility, enabling coverage of 3–4 facilities per day.</w:t>
+        <w:t>Team management: Paul Mubiri will serve as the single point of contact with Tiko's programme team. Weekly internal team briefings will ensure consistent tool application and data quality. Raymond Wayesu will provide centralised data management and analysis support, enabling rapid turnaround of facility reports. The two-person core team will deploy together for on-site facility visits, with each member bringing complementary skills in data verification and statistical analysis.</w:t>
       </w:r>
     </w:p>
     <w:p>
@@ -5382,15 +5338,7 @@
         <w:spacing w:before="240" w:after="120"/>
       </w:pPr>
       <w:r>
-        <w:rPr>
-          <w:rFonts w:ascii="Arial" w:cs="Arial" w:eastAsia="Arial" w:hAnsi="Arial"/>
-          <w:b/>
-          <w:bCs/>
-          <w:color w:val="2E86C1"/>
-          <w:sz w:val="24"/>
-          <w:szCs w:val="24"/>
-        </w:rPr>
-        <w:t xml:space="preserve">5.1 Team Gaps and Recruitment Plan</w:t>
+        <w:t>5.1 Field Support and Scalability</w:t>
       </w:r>
     </w:p>
     <w:p>
@@ -5399,16 +5347,7 @@
         <w:jc w:val="both"/>
       </w:pPr>
       <w:r>
-        <w:rPr>
-          <w:rFonts w:ascii="Arial" w:cs="Arial" w:eastAsia="Arial" w:hAnsi="Arial"/>
-          <w:b w:val="false"/>
-          <w:bCs w:val="false"/>
-          <w:i w:val="false"/>
-          <w:iCs w:val="false"/>
-          <w:sz w:val="20"/>
-          <w:szCs w:val="20"/>
-        </w:rPr>
-        <w:t xml:space="preserve">We will recruit 2–4 Field Data Quality Auditors with specific experience in HMIS register review and facility-based data verification in Kampala and Wakiso. Recruitment criteria include a bachelor’s degree in public health, statistics, or a related field; at least 3 years of experience working with Uganda’s HMIS tools; and demonstrated familiarity with digital data collection platforms. Recruitment will be completed during the inception phase (by 13 March 2026) and all field auditors will undergo a 2-day training and pilot exercise before the first full RDQA cycle.</w:t>
+        <w:t>The core two-person team is structured to efficiently cover the monthly RDQA cycle across 5 working days per month each. Should the number of facilities per audit cycle require additional capacity, we will coordinate with Tiko to identify suitable field support staff with experience in HMIS register review and facility-based data verification in Kampala and Wakiso. Any supplementary field personnel would meet the following criteria: a bachelor's degree in public health, statistics, or a related field; at least 3 years of experience working with Uganda's HMIS tools; and familiarity with digital data collection platforms.</w:t>
       </w:r>
     </w:p>
     <w:p>
@@ -6651,22 +6590,7 @@
         <w:spacing w:before="40" w:after="40"/>
       </w:pPr>
       <w:r>
-        <w:rPr>
-          <w:rFonts w:ascii="Arial" w:cs="Arial" w:eastAsia="Arial" w:hAnsi="Arial"/>
-          <w:b/>
-          <w:bCs/>
-          <w:sz w:val="20"/>
-          <w:szCs w:val="20"/>
-        </w:rPr>
-        <w:t xml:space="preserve">Preterm Birth Initiative (PTBi), Makerere University School of Public Health (2016–2019): </w:t>
-      </w:r>
-      <w:r>
-        <w:rPr>
-          <w:rFonts w:ascii="Arial" w:cs="Arial" w:eastAsia="Arial" w:hAnsi="Arial"/>
-          <w:sz w:val="20"/>
-          <w:szCs w:val="20"/>
-        </w:rPr>
-        <w:t xml:space="preserve">Paul Mubiri served as Biostatistician conducting routine data quality assessments, data quality assurance, and health facility assessments across implementation science study sites in Eastern Uganda. This included direct register verification, data coding, and stakeholder presentation of findings.</w:t>
+        <w:t>Preterm Birth Initiative (PTBi), Makerere University School of Public Health (2016–2019): Paul Mubiri served as Biostatistician conducting routine data quality assessments, data quality assurance, and health facility assessments across implementation science study sites in Eastern Uganda. Responsibilities included data verification from primary registers, statistical analysis using STATA and R, REDCap database management, and presentation of findings to project stakeholders and the Data Safety Monitoring Board.</w:t>
       </w:r>
     </w:p>
     <w:p>
@@ -6679,22 +6603,7 @@
         <w:spacing w:before="40" w:after="40"/>
       </w:pPr>
       <w:r>
-        <w:rPr>
-          <w:rFonts w:ascii="Arial" w:cs="Arial" w:eastAsia="Arial" w:hAnsi="Arial"/>
-          <w:b/>
-          <w:bCs/>
-          <w:sz w:val="20"/>
-          <w:szCs w:val="20"/>
-        </w:rPr>
-        <w:t xml:space="preserve">Maryland Global Initiative Corporation / University of Maryland Baltimore (2022–2023): </w:t>
-      </w:r>
-      <w:r>
-        <w:rPr>
-          <w:rFonts w:ascii="Arial" w:cs="Arial" w:eastAsia="Arial" w:hAnsi="Arial"/>
-          <w:sz w:val="20"/>
-          <w:szCs w:val="20"/>
-        </w:rPr>
-        <w:t xml:space="preserve">Paul Mubiri supported project data analysis, data quality assessment and improvement, tool design, Power BI visualisation, and capacity building with the Strategic Information and M&amp;E team under the PEPFAR consortium.</w:t>
+        <w:t>Maryland Global Initiative Corporation / University of Maryland Baltimore (MGIC/UMB) (2022–2023): Paul Mubiri supported project data analysis, data quality assessment and improvement, tool design, Power BI visualisation and dashboard development, and capacity building with the Strategic Information and M&amp;E team under the PEPFAR consortium. This included regular data quality audits across PEPFAR-supported health facilities.</w:t>
       </w:r>
     </w:p>
     <w:p>
@@ -6763,22 +6672,7 @@
         <w:spacing w:before="40" w:after="40"/>
       </w:pPr>
       <w:r>
-        <w:rPr>
-          <w:rFonts w:ascii="Arial" w:cs="Arial" w:eastAsia="Arial" w:hAnsi="Arial"/>
-          <w:b/>
-          <w:bCs/>
-          <w:sz w:val="20"/>
-          <w:szCs w:val="20"/>
-        </w:rPr>
-        <w:t xml:space="preserve">Uganda Virus Research Institute – CEPI Project (2024–present): </w:t>
-      </w:r>
-      <w:r>
-        <w:rPr>
-          <w:rFonts w:ascii="Arial" w:cs="Arial" w:eastAsia="Arial" w:hAnsi="Arial"/>
-          <w:sz w:val="20"/>
-          <w:szCs w:val="20"/>
-        </w:rPr>
-        <w:t xml:space="preserve">Raymond Wayesu serves as Biostatistician applying advanced statistical methods to immunology studies, with responsibility for research design, data interpretation, and quality assurance of laboratory data.</w:t>
+        <w:t>Uganda Virus Research Institute / London School of Hygiene &amp; Tropical Medicine (UVRI/LSHTM) – CEPI Project (2024–present): Raymond Wayesu serves as Medical Statistician applying advanced statistical methods to immunology and vaccine studies. Responsibilities include research design, sample size estimation, statistical modelling in R and SAS, data quality assurance of laboratory datasets, and preparation of manuscripts for peer-reviewed publication.</w:t>
       </w:r>
     </w:p>
     <w:p>
@@ -6828,16 +6722,7 @@
         <w:jc w:val="both"/>
       </w:pPr>
       <w:r>
-        <w:rPr>
-          <w:rFonts w:ascii="Arial" w:cs="Arial" w:eastAsia="Arial" w:hAnsi="Arial"/>
-          <w:b w:val="false"/>
-          <w:bCs w:val="false"/>
-          <w:i w:val="false"/>
-          <w:iCs w:val="false"/>
-          <w:sz w:val="20"/>
-          <w:szCs w:val="20"/>
-        </w:rPr>
-        <w:t xml:space="preserve">A detailed budget breakdown will be provided in a separate financial proposal. The following framework outlines the major cost categories and assumptions:</w:t>
+        <w:t>The financial proposal totals USD 11,650 for the 10-month assignment (March–December 2026). The budget is structured across four categories: Professional Fees (lead consultant and data analyst at daily rates), Transport and Logistics, Data Collection Tools (KoboToolbox, printing, mobile data), and Communication. A detailed breakdown is provided in the accompanying budget spreadsheet.</w:t>
       </w:r>
     </w:p>
     <w:tbl>
@@ -6988,13 +6873,9 @@
             </w:pPr>
             <w:r>
               <w:rPr>
-                <w:rFonts w:ascii="Arial" w:cs="Arial" w:eastAsia="Arial" w:hAnsi="Arial"/>
-                <w:b/>
-                <w:bCs/>
-                <w:sz w:val="20"/>
-                <w:szCs w:val="20"/>
-              </w:rPr>
-              <w:t xml:space="preserve">Professional Fees</w:t>
+                <w:sz w:val="18"/>
+              </w:rPr>
+              <w:t>Professional Fees</w:t>
             </w:r>
           </w:p>
         </w:tc>
@@ -7021,13 +6902,9 @@
             </w:pPr>
             <w:r>
               <w:rPr>
-                <w:rFonts w:ascii="Arial" w:cs="Arial" w:eastAsia="Arial" w:hAnsi="Arial"/>
-                <w:b w:val="false"/>
-                <w:bCs w:val="false"/>
-                <w:sz w:val="20"/>
-                <w:szCs w:val="20"/>
-              </w:rPr>
-              <w:t xml:space="preserve">Lead Consultant, Data Analyst, Field Auditors</w:t>
+                <w:sz w:val="18"/>
+              </w:rPr>
+              <w:t>Lead Consultant (Paul Mubiri) and Data Analyst (Raymond Wayesu)</w:t>
             </w:r>
           </w:p>
         </w:tc>
@@ -7054,13 +6931,9 @@
             </w:pPr>
             <w:r>
               <w:rPr>
-                <w:rFonts w:ascii="Arial" w:cs="Arial" w:eastAsia="Arial" w:hAnsi="Arial"/>
-                <w:b w:val="false"/>
-                <w:bCs w:val="false"/>
-                <w:sz w:val="20"/>
-                <w:szCs w:val="20"/>
-              </w:rPr>
-              <w:t xml:space="preserve">Daily rates per role; number of working days per month</w:t>
+                <w:sz w:val="18"/>
+              </w:rPr>
+              <w:t>Daily rates × 5 working days/month × 10 months</w:t>
             </w:r>
           </w:p>
         </w:tc>
@@ -7089,13 +6962,9 @@
             </w:pPr>
             <w:r>
               <w:rPr>
-                <w:rFonts w:ascii="Arial" w:cs="Arial" w:eastAsia="Arial" w:hAnsi="Arial"/>
-                <w:b/>
-                <w:bCs/>
-                <w:sz w:val="20"/>
-                <w:szCs w:val="20"/>
-              </w:rPr>
-              <w:t xml:space="preserve">Transport and Logistics</w:t>
+                <w:sz w:val="18"/>
+              </w:rPr>
+              <w:t>Transport and Logistics</w:t>
             </w:r>
           </w:p>
         </w:tc>
@@ -7122,13 +6991,9 @@
             </w:pPr>
             <w:r>
               <w:rPr>
-                <w:rFonts w:ascii="Arial" w:cs="Arial" w:eastAsia="Arial" w:hAnsi="Arial"/>
-                <w:b w:val="false"/>
-                <w:bCs w:val="false"/>
-                <w:sz w:val="20"/>
-                <w:szCs w:val="20"/>
-              </w:rPr>
-              <w:t xml:space="preserve">Vehicle hire, fuel, field team travel within Kampala and Wakiso</w:t>
+                <w:sz w:val="18"/>
+              </w:rPr>
+              <w:t>Team will utilise existing transport resources</w:t>
             </w:r>
           </w:p>
         </w:tc>
@@ -7155,13 +7020,9 @@
             </w:pPr>
             <w:r>
               <w:rPr>
-                <w:rFonts w:ascii="Arial" w:cs="Arial" w:eastAsia="Arial" w:hAnsi="Arial"/>
-                <w:b w:val="false"/>
-                <w:bCs w:val="false"/>
-                <w:sz w:val="20"/>
-                <w:szCs w:val="20"/>
-              </w:rPr>
-              <w:t xml:space="preserve">Per facility visit; estimated distances and facility density</w:t>
+                <w:sz w:val="18"/>
+              </w:rPr>
+              <w:t>Included in professional fees</w:t>
             </w:r>
           </w:p>
         </w:tc>
@@ -7190,13 +7051,9 @@
             </w:pPr>
             <w:r>
               <w:rPr>
-                <w:rFonts w:ascii="Arial" w:cs="Arial" w:eastAsia="Arial" w:hAnsi="Arial"/>
-                <w:b/>
-                <w:bCs/>
-                <w:sz w:val="20"/>
-                <w:szCs w:val="20"/>
-              </w:rPr>
-              <w:t xml:space="preserve">Data Collection Tools</w:t>
+                <w:sz w:val="18"/>
+              </w:rPr>
+              <w:t>Data Collection Tools</w:t>
             </w:r>
           </w:p>
         </w:tc>
@@ -7223,13 +7080,9 @@
             </w:pPr>
             <w:r>
               <w:rPr>
-                <w:rFonts w:ascii="Arial" w:cs="Arial" w:eastAsia="Arial" w:hAnsi="Arial"/>
-                <w:b w:val="false"/>
-                <w:bCs w:val="false"/>
-                <w:sz w:val="20"/>
-                <w:szCs w:val="20"/>
-              </w:rPr>
-              <w:t xml:space="preserve">KoboToolbox (free tier), printing of backup forms, mobile data</w:t>
+                <w:sz w:val="18"/>
+              </w:rPr>
+              <w:t>KoboToolbox subscription, printing of RDQA forms and checklists, mobile data bundles</w:t>
             </w:r>
           </w:p>
         </w:tc>
@@ -7256,13 +7109,9 @@
             </w:pPr>
             <w:r>
               <w:rPr>
-                <w:rFonts w:ascii="Arial" w:cs="Arial" w:eastAsia="Arial" w:hAnsi="Arial"/>
-                <w:b w:val="false"/>
-                <w:bCs w:val="false"/>
-                <w:sz w:val="20"/>
-                <w:szCs w:val="20"/>
-              </w:rPr>
-              <w:t xml:space="preserve">Lump sum per month</w:t>
+                <w:sz w:val="18"/>
+              </w:rPr>
+              <w:t>Lump sum and monthly allocations</w:t>
             </w:r>
           </w:p>
         </w:tc>
@@ -7291,13 +7140,9 @@
             </w:pPr>
             <w:r>
               <w:rPr>
-                <w:rFonts w:ascii="Arial" w:cs="Arial" w:eastAsia="Arial" w:hAnsi="Arial"/>
-                <w:b/>
-                <w:bCs/>
-                <w:sz w:val="20"/>
-                <w:szCs w:val="20"/>
-              </w:rPr>
-              <w:t xml:space="preserve">Communication</w:t>
+                <w:sz w:val="18"/>
+              </w:rPr>
+              <w:t>Communication</w:t>
             </w:r>
           </w:p>
         </w:tc>
@@ -7324,13 +7169,9 @@
             </w:pPr>
             <w:r>
               <w:rPr>
-                <w:rFonts w:ascii="Arial" w:cs="Arial" w:eastAsia="Arial" w:hAnsi="Arial"/>
-                <w:b w:val="false"/>
-                <w:bCs w:val="false"/>
-                <w:sz w:val="20"/>
-                <w:szCs w:val="20"/>
-              </w:rPr>
-              <w:t xml:space="preserve">Airtime, internet, coordination calls</w:t>
+                <w:sz w:val="18"/>
+              </w:rPr>
+              <w:t>Airtime, internet, team coordination</w:t>
             </w:r>
           </w:p>
         </w:tc>
@@ -7357,13 +7198,9 @@
             </w:pPr>
             <w:r>
               <w:rPr>
-                <w:rFonts w:ascii="Arial" w:cs="Arial" w:eastAsia="Arial" w:hAnsi="Arial"/>
-                <w:b w:val="false"/>
-                <w:bCs w:val="false"/>
-                <w:sz w:val="20"/>
-                <w:szCs w:val="20"/>
-              </w:rPr>
-              <w:t xml:space="preserve">Monthly lump sum</w:t>
+                <w:sz w:val="18"/>
+              </w:rPr>
+              <w:t>Monthly lump sum</w:t>
             </w:r>
           </w:p>
         </w:tc>
@@ -7390,16 +7227,6 @@
             <w:pPr>
               <w:jc w:val="left"/>
             </w:pPr>
-            <w:r>
-              <w:rPr>
-                <w:rFonts w:ascii="Arial" w:cs="Arial" w:eastAsia="Arial" w:hAnsi="Arial"/>
-                <w:b/>
-                <w:bCs/>
-                <w:sz w:val="20"/>
-                <w:szCs w:val="20"/>
-              </w:rPr>
-              <w:t xml:space="preserve">Report Production</w:t>
-            </w:r>
           </w:p>
         </w:tc>
         <w:tc>
@@ -7423,16 +7250,6 @@
             <w:pPr>
               <w:jc w:val="left"/>
             </w:pPr>
-            <w:r>
-              <w:rPr>
-                <w:rFonts w:ascii="Arial" w:cs="Arial" w:eastAsia="Arial" w:hAnsi="Arial"/>
-                <w:b w:val="false"/>
-                <w:bCs w:val="false"/>
-                <w:sz w:val="20"/>
-                <w:szCs w:val="20"/>
-              </w:rPr>
-              <w:t xml:space="preserve">Printing, binding, data visualisation software</w:t>
-            </w:r>
           </w:p>
         </w:tc>
         <w:tc>
@@ -7456,16 +7273,6 @@
             <w:pPr>
               <w:jc w:val="left"/>
             </w:pPr>
-            <w:r>
-              <w:rPr>
-                <w:rFonts w:ascii="Arial" w:cs="Arial" w:eastAsia="Arial" w:hAnsi="Arial"/>
-                <w:b w:val="false"/>
-                <w:bCs w:val="false"/>
-                <w:sz w:val="20"/>
-                <w:szCs w:val="20"/>
-              </w:rPr>
-              <w:t xml:space="preserve">Per deliverable</w:t>
-            </w:r>
           </w:p>
         </w:tc>
       </w:tr>
@@ -7491,16 +7298,6 @@
             <w:pPr>
               <w:jc w:val="left"/>
             </w:pPr>
-            <w:r>
-              <w:rPr>
-                <w:rFonts w:ascii="Arial" w:cs="Arial" w:eastAsia="Arial" w:hAnsi="Arial"/>
-                <w:b/>
-                <w:bCs/>
-                <w:sz w:val="20"/>
-                <w:szCs w:val="20"/>
-              </w:rPr>
-              <w:t xml:space="preserve">Training and Piloting</w:t>
-            </w:r>
           </w:p>
         </w:tc>
         <w:tc>
@@ -7524,16 +7321,6 @@
             <w:pPr>
               <w:jc w:val="left"/>
             </w:pPr>
-            <w:r>
-              <w:rPr>
-                <w:rFonts w:ascii="Arial" w:cs="Arial" w:eastAsia="Arial" w:hAnsi="Arial"/>
-                <w:b w:val="false"/>
-                <w:bCs w:val="false"/>
-                <w:sz w:val="20"/>
-                <w:szCs w:val="20"/>
-              </w:rPr>
-              <w:t xml:space="preserve">Field auditor training (2 days), pilot at 2–3 facilities</w:t>
-            </w:r>
           </w:p>
         </w:tc>
         <w:tc>
@@ -7557,16 +7344,6 @@
             <w:pPr>
               <w:jc w:val="left"/>
             </w:pPr>
-            <w:r>
-              <w:rPr>
-                <w:rFonts w:ascii="Arial" w:cs="Arial" w:eastAsia="Arial" w:hAnsi="Arial"/>
-                <w:b w:val="false"/>
-                <w:bCs w:val="false"/>
-                <w:sz w:val="20"/>
-                <w:szCs w:val="20"/>
-              </w:rPr>
-              <w:t xml:space="preserve">One-time during inception</w:t>
-            </w:r>
           </w:p>
         </w:tc>
       </w:tr>
@@ -7592,16 +7369,6 @@
             <w:pPr>
               <w:jc w:val="left"/>
             </w:pPr>
-            <w:r>
-              <w:rPr>
-                <w:rFonts w:ascii="Arial" w:cs="Arial" w:eastAsia="Arial" w:hAnsi="Arial"/>
-                <w:b/>
-                <w:bCs/>
-                <w:sz w:val="20"/>
-                <w:szCs w:val="20"/>
-              </w:rPr>
-              <w:t xml:space="preserve">Quarterly Review Sessions</w:t>
-            </w:r>
           </w:p>
         </w:tc>
         <w:tc>
@@ -7625,16 +7392,6 @@
             <w:pPr>
               <w:jc w:val="left"/>
             </w:pPr>
-            <w:r>
-              <w:rPr>
-                <w:rFonts w:ascii="Arial" w:cs="Arial" w:eastAsia="Arial" w:hAnsi="Arial"/>
-                <w:b w:val="false"/>
-                <w:bCs w:val="false"/>
-                <w:sz w:val="20"/>
-                <w:szCs w:val="20"/>
-              </w:rPr>
-              <w:t xml:space="preserve">Venue (if needed), materials, facilitation</w:t>
-            </w:r>
           </w:p>
         </w:tc>
         <w:tc>
@@ -7658,16 +7415,6 @@
             <w:pPr>
               <w:jc w:val="left"/>
             </w:pPr>
-            <w:r>
-              <w:rPr>
-                <w:rFonts w:ascii="Arial" w:cs="Arial" w:eastAsia="Arial" w:hAnsi="Arial"/>
-                <w:b w:val="false"/>
-                <w:bCs w:val="false"/>
-                <w:sz w:val="20"/>
-                <w:szCs w:val="20"/>
-              </w:rPr>
-              <w:t xml:space="preserve">3 sessions over the assignment period</w:t>
-            </w:r>
           </w:p>
         </w:tc>
       </w:tr>
@@ -7693,16 +7440,6 @@
             <w:pPr>
               <w:jc w:val="left"/>
             </w:pPr>
-            <w:r>
-              <w:rPr>
-                <w:rFonts w:ascii="Arial" w:cs="Arial" w:eastAsia="Arial" w:hAnsi="Arial"/>
-                <w:b/>
-                <w:bCs/>
-                <w:sz w:val="20"/>
-                <w:szCs w:val="20"/>
-              </w:rPr>
-              <w:t xml:space="preserve">Contingency (7%)</w:t>
-            </w:r>
           </w:p>
         </w:tc>
         <w:tc>
@@ -7726,16 +7463,6 @@
             <w:pPr>
               <w:jc w:val="left"/>
             </w:pPr>
-            <w:r>
-              <w:rPr>
-                <w:rFonts w:ascii="Arial" w:cs="Arial" w:eastAsia="Arial" w:hAnsi="Arial"/>
-                <w:b w:val="false"/>
-                <w:bCs w:val="false"/>
-                <w:sz w:val="20"/>
-                <w:szCs w:val="20"/>
-              </w:rPr>
-              <w:t xml:space="preserve">Unforeseen costs, additional facilities, extended fieldwork</w:t>
-            </w:r>
           </w:p>
         </w:tc>
         <w:tc>
@@ -7759,16 +7486,6 @@
             <w:pPr>
               <w:jc w:val="left"/>
             </w:pPr>
-            <w:r>
-              <w:rPr>
-                <w:rFonts w:ascii="Arial" w:cs="Arial" w:eastAsia="Arial" w:hAnsi="Arial"/>
-                <w:b w:val="false"/>
-                <w:bCs w:val="false"/>
-                <w:sz w:val="20"/>
-                <w:szCs w:val="20"/>
-              </w:rPr>
-              <w:t xml:space="preserve">Percentage of subtotal</w:t>
-            </w:r>
           </w:p>
         </w:tc>
       </w:tr>
@@ -7779,22 +7496,7 @@
         <w:jc w:val="both"/>
       </w:pPr>
       <w:r>
-        <w:rPr>
-          <w:rFonts w:ascii="Arial" w:cs="Arial" w:eastAsia="Arial" w:hAnsi="Arial"/>
-          <w:b/>
-          <w:bCs/>
-          <w:sz w:val="20"/>
-          <w:szCs w:val="20"/>
-        </w:rPr>
-        <w:t xml:space="preserve">Note: </w:t>
-      </w:r>
-      <w:r>
-        <w:rPr>
-          <w:rFonts w:ascii="Arial" w:cs="Arial" w:eastAsia="Arial" w:hAnsi="Arial"/>
-          <w:sz w:val="20"/>
-          <w:szCs w:val="20"/>
-        </w:rPr>
-        <w:t xml:space="preserve">Final costing will be calibrated to the confirmed number of facilities per month, as communicated by Tiko in advance of each audit cycle. The budget is structured to offer value for money by leveraging existing digital tools (KoboToolbox free tier, DHIS2 WHO DQ App), deploying locally-based team members (eliminating accommodation costs), and using efficient parallel sub-team deployment to maximise facility coverage per field day.</w:t>
+        <w:t>Note: Final costing will be calibrated to the confirmed number of facilities per month, as communicated by Tiko in advance of each audit cycle. The budget is structured to offer value for money by leveraging existing digital tools (KoboToolbox, DHIS2 WHO DQ App), deploying locally-based team members (eliminating accommodation and transport overhead), and maximising efficiency through a lean two-person core team with deep technical expertise.</w:t>
       </w:r>
     </w:p>
     <w:p>

</xml_diff>